<commit_message>
Chuong 4: bon hinh theo dung bo cuc v11
v11 co bon hinh trong Chuong 4 (4.1-4.4) nhung scripts/08_make_docx.py chi sinh
bang. Bo sung scripts/09_make_figures.py ve dung bon hinh do tu experiments/runs
va nhung vao Word: anh can giua, caption in dam can giua dat PHIA DUOI anh, ben
rong 5.71 inch -- giong het quy uoc cua v11.

Hinh doc cung nguon voi bang (`load_runs`) va di qua cung guard
`assert_no_duplicate_cells`, nen hinh khong the noi khac bang so ngay tren no.
Guard duoc chuyen tu scripts/06_make_tables.py sang src/evaluation/reporting.py
de ca hai script dung chung mot ban.

Truc loss dung thang log: loss BPR roi tu ~0.6 xuong ~0.006, tren thang tuyen
tinh moi duong deu dinh vao 0 sau epoch 50. Mau gan co dinh theo mo hinh
(Okabe-Ito, an toan cho nguoi mu mau) va moi duong co kieu net rieng.

`make docx` phu thuoc `make figures` de khong bao gio dong bang so moi vao hinh cu.

274 test pass.
</commit_message>
<xml_diff>
--- a/docs/Chuong4_viet_lai.docx
+++ b/docs/Chuong4_viet_lai.docx
@@ -1003,7 +1003,7 @@
           </w:tcPr>
           <w:p>
             <w:r>
-              <w:t>0.023736 ± 0.003524</w:t>
+              <w:t>0.025544 ± 0.000000</w:t>
             </w:r>
           </w:p>
         </w:tc>
@@ -1013,7 +1013,7 @@
           </w:tcPr>
           <w:p>
             <w:r>
-              <w:t>0.014803 ± 0.002754</w:t>
+              <w:t>0.015901 ± 0.000000</w:t>
             </w:r>
           </w:p>
         </w:tc>
@@ -1023,7 +1023,7 @@
           </w:tcPr>
           <w:p>
             <w:r>
-              <w:t>0.046655 ± 0.004244</w:t>
+              <w:t>0.047218 ± 0.000000</w:t>
             </w:r>
           </w:p>
         </w:tc>
@@ -1033,193 +1033,7 @@
           </w:tcPr>
           <w:p>
             <w:r>
-              <w:t>0.020544 ± 0.001101</w:t>
-            </w:r>
-          </w:p>
-        </w:tc>
-      </w:tr>
-      <w:tr>
-        <w:tc>
-          <w:tcPr>
-            <w:tcW w:type="dxa" w:w="1465"/>
-          </w:tcPr>
-          <w:p>
-            <w:r>
-              <w:t>Static KG-GCN</w:t>
-            </w:r>
-          </w:p>
-        </w:tc>
-        <w:tc>
-          <w:tcPr>
-            <w:tcW w:type="dxa" w:w="1465"/>
-          </w:tcPr>
-          <w:p>
-            <w:r>
-              <w:t>593</w:t>
-            </w:r>
-          </w:p>
-        </w:tc>
-        <w:tc>
-          <w:tcPr>
-            <w:tcW w:type="dxa" w:w="1465"/>
-          </w:tcPr>
-          <w:p>
-            <w:r>
-              <w:t>0.027178 ± 0.005070</w:t>
-            </w:r>
-          </w:p>
-        </w:tc>
-        <w:tc>
-          <w:tcPr>
-            <w:tcW w:type="dxa" w:w="1465"/>
-          </w:tcPr>
-          <w:p>
-            <w:r>
-              <w:t>0.015909 ± 0.003143</w:t>
-            </w:r>
-          </w:p>
-        </w:tc>
-        <w:tc>
-          <w:tcPr>
-            <w:tcW w:type="dxa" w:w="1465"/>
-          </w:tcPr>
-          <w:p>
-            <w:r>
-              <w:t>0.053963 ± 0.007351</w:t>
-            </w:r>
-          </w:p>
-        </w:tc>
-        <w:tc>
-          <w:tcPr>
-            <w:tcW w:type="dxa" w:w="1465"/>
-          </w:tcPr>
-          <w:p>
-            <w:r>
-              <w:t>0.021152 ± 0.000694</w:t>
-            </w:r>
-          </w:p>
-        </w:tc>
-      </w:tr>
-      <w:tr>
-        <w:tc>
-          <w:tcPr>
-            <w:tcW w:type="dxa" w:w="1465"/>
-          </w:tcPr>
-          <w:p>
-            <w:r>
-              <w:t>BT-DKGRec-GCN (λ=0,01)</w:t>
-            </w:r>
-          </w:p>
-        </w:tc>
-        <w:tc>
-          <w:tcPr>
-            <w:tcW w:type="dxa" w:w="1465"/>
-          </w:tcPr>
-          <w:p>
-            <w:r>
-              <w:t>593</w:t>
-            </w:r>
-          </w:p>
-        </w:tc>
-        <w:tc>
-          <w:tcPr>
-            <w:tcW w:type="dxa" w:w="1465"/>
-          </w:tcPr>
-          <w:p>
-            <w:r>
-              <w:t>0.028778 ± 0.004961</w:t>
-            </w:r>
-          </w:p>
-        </w:tc>
-        <w:tc>
-          <w:tcPr>
-            <w:tcW w:type="dxa" w:w="1465"/>
-          </w:tcPr>
-          <w:p>
-            <w:r>
-              <w:t>0.015708 ± 0.001940</w:t>
-            </w:r>
-          </w:p>
-        </w:tc>
-        <w:tc>
-          <w:tcPr>
-            <w:tcW w:type="dxa" w:w="1465"/>
-          </w:tcPr>
-          <w:p>
-            <w:r>
-              <w:t>0.055087 ± 0.007604</w:t>
-            </w:r>
-          </w:p>
-        </w:tc>
-        <w:tc>
-          <w:tcPr>
-            <w:tcW w:type="dxa" w:w="1465"/>
-          </w:tcPr>
-          <w:p>
-            <w:r>
-              <w:t>0.020027 ± 0.001476</w:t>
-            </w:r>
-          </w:p>
-        </w:tc>
-      </w:tr>
-      <w:tr>
-        <w:tc>
-          <w:tcPr>
-            <w:tcW w:type="dxa" w:w="1465"/>
-          </w:tcPr>
-          <w:p>
-            <w:r>
-              <w:t>BT-DKGRec-GCN (λ=0,05)</w:t>
-            </w:r>
-          </w:p>
-        </w:tc>
-        <w:tc>
-          <w:tcPr>
-            <w:tcW w:type="dxa" w:w="1465"/>
-          </w:tcPr>
-          <w:p>
-            <w:r>
-              <w:t>593</w:t>
-            </w:r>
-          </w:p>
-        </w:tc>
-        <w:tc>
-          <w:tcPr>
-            <w:tcW w:type="dxa" w:w="1465"/>
-          </w:tcPr>
-          <w:p>
-            <w:r>
-              <w:t>0.030453 ± 0.002048</w:t>
-            </w:r>
-          </w:p>
-        </w:tc>
-        <w:tc>
-          <w:tcPr>
-            <w:tcW w:type="dxa" w:w="1465"/>
-          </w:tcPr>
-          <w:p>
-            <w:r>
-              <w:t>0.017704 ± 0.001954</w:t>
-            </w:r>
-          </w:p>
-        </w:tc>
-        <w:tc>
-          <w:tcPr>
-            <w:tcW w:type="dxa" w:w="1465"/>
-          </w:tcPr>
-          <w:p>
-            <w:r>
-              <w:t>0.060708 ± 0.008762</w:t>
-            </w:r>
-          </w:p>
-        </w:tc>
-        <w:tc>
-          <w:tcPr>
-            <w:tcW w:type="dxa" w:w="1465"/>
-          </w:tcPr>
-          <w:p>
-            <w:r>
-              <w:t>0.022865 ± 0.004165</w:t>
+              <w:t>0.019409 ± 0.000000</w:t>
             </w:r>
           </w:p>
         </w:tc>
@@ -1229,6 +1043,111 @@
     <w:p>
       <w:r>
         <w:t>Popularity và Recent Popularity là mô hình tất định, không phụ thuộc seed, nên độ lệch chuẩn bằng 0. Đây là tính chất của mô hình, không phải lỗi tính toán.</w:t>
+      </w:r>
+    </w:p>
+    <w:p>
+      <w:pPr>
+        <w:jc w:val="center"/>
+      </w:pPr>
+      <w:r>
+        <w:drawing>
+          <wp:inline xmlns:a="http://schemas.openxmlformats.org/drawingml/2006/main" xmlns:pic="http://schemas.openxmlformats.org/drawingml/2006/picture">
+            <wp:extent cx="5221224" cy="3620421"/>
+            <wp:docPr id="1" name="Picture 1"/>
+            <wp:cNvGraphicFramePr>
+              <a:graphicFrameLocks noChangeAspect="1"/>
+            </wp:cNvGraphicFramePr>
+            <a:graphic>
+              <a:graphicData uri="http://schemas.openxmlformats.org/drawingml/2006/picture">
+                <pic:pic>
+                  <pic:nvPicPr>
+                    <pic:cNvPr id="0" name="original_metrics.png"/>
+                    <pic:cNvPicPr/>
+                  </pic:nvPicPr>
+                  <pic:blipFill>
+                    <a:blip r:embed="rId21"/>
+                    <a:stretch>
+                      <a:fillRect/>
+                    </a:stretch>
+                  </pic:blipFill>
+                  <pic:spPr>
+                    <a:xfrm>
+                      <a:off x="0" y="0"/>
+                      <a:ext cx="5221224" cy="3620421"/>
+                    </a:xfrm>
+                    <a:prstGeom prst="rect"/>
+                  </pic:spPr>
+                </pic:pic>
+              </a:graphicData>
+            </a:graphic>
+          </wp:inline>
+        </w:drawing>
+      </w:r>
+    </w:p>
+    <w:p>
+      <w:pPr>
+        <w:jc w:val="center"/>
+      </w:pPr>
+      <w:r>
+        <w:rPr>
+          <w:b/>
+        </w:rPr>
+        <w:t>Hình 4.1. So sánh các chỉ số test trên nhóm người dùng có lịch sử ban đầu</w:t>
+      </w:r>
+    </w:p>
+    <w:p>
+      <w:pPr>
+        <w:jc w:val="center"/>
+      </w:pPr>
+      <w:r>
+        <w:drawing>
+          <wp:inline xmlns:a="http://schemas.openxmlformats.org/drawingml/2006/main" xmlns:pic="http://schemas.openxmlformats.org/drawingml/2006/picture">
+            <wp:extent cx="5221224" cy="2918291"/>
+            <wp:docPr id="2" name="Picture 2"/>
+            <wp:cNvGraphicFramePr>
+              <a:graphicFrameLocks noChangeAspect="1"/>
+            </wp:cNvGraphicFramePr>
+            <a:graphic>
+              <a:graphicData uri="http://schemas.openxmlformats.org/drawingml/2006/picture">
+                <pic:pic>
+                  <pic:nvPicPr>
+                    <pic:cNvPr id="0" name="original_loss.png"/>
+                    <pic:cNvPicPr/>
+                  </pic:nvPicPr>
+                  <pic:blipFill>
+                    <a:blip r:embed="rId22"/>
+                    <a:stretch>
+                      <a:fillRect/>
+                    </a:stretch>
+                  </pic:blipFill>
+                  <pic:spPr>
+                    <a:xfrm>
+                      <a:off x="0" y="0"/>
+                      <a:ext cx="5221224" cy="2918291"/>
+                    </a:xfrm>
+                    <a:prstGeom prst="rect"/>
+                  </pic:spPr>
+                </pic:pic>
+              </a:graphicData>
+            </a:graphic>
+          </wp:inline>
+        </w:drawing>
+      </w:r>
+    </w:p>
+    <w:p>
+      <w:pPr>
+        <w:jc w:val="center"/>
+      </w:pPr>
+      <w:r>
+        <w:rPr>
+          <w:b/>
+        </w:rPr>
+        <w:t>Hình 4.2. Đường loss huấn luyện của các mô hình trên original split</w:t>
+      </w:r>
+    </w:p>
+    <w:p>
+      <w:r>
+        <w:t>Trục loss dùng thang log; trên thang tuyến tính mọi đường đều dính vào 0 sau khoảng epoch 50 và không còn đọc được phần hội tụ. Đường vẽ là trung bình theo các seed, dải nền là khoảng min-max giữa các seed. Hai mô hình tất định không có đường loss nên không xuất hiện trong hình.</w:t>
       </w:r>
     </w:p>
     <w:p>
@@ -1731,6 +1650,111 @@
     </w:p>
     <w:p>
       <w:pPr>
+        <w:jc w:val="center"/>
+      </w:pPr>
+      <w:r>
+        <w:drawing>
+          <wp:inline xmlns:a="http://schemas.openxmlformats.org/drawingml/2006/main" xmlns:pic="http://schemas.openxmlformats.org/drawingml/2006/picture">
+            <wp:extent cx="5221224" cy="3620421"/>
+            <wp:docPr id="3" name="Picture 3"/>
+            <wp:cNvGraphicFramePr>
+              <a:graphicFrameLocks noChangeAspect="1"/>
+            </wp:cNvGraphicFramePr>
+            <a:graphic>
+              <a:graphicData uri="http://schemas.openxmlformats.org/drawingml/2006/picture">
+                <pic:pic>
+                  <pic:nvPicPr>
+                    <pic:cNvPr id="0" name="active_metrics.png"/>
+                    <pic:cNvPicPr/>
+                  </pic:nvPicPr>
+                  <pic:blipFill>
+                    <a:blip r:embed="rId23"/>
+                    <a:stretch>
+                      <a:fillRect/>
+                    </a:stretch>
+                  </pic:blipFill>
+                  <pic:spPr>
+                    <a:xfrm>
+                      <a:off x="0" y="0"/>
+                      <a:ext cx="5221224" cy="3620421"/>
+                    </a:xfrm>
+                    <a:prstGeom prst="rect"/>
+                  </pic:spPr>
+                </pic:pic>
+              </a:graphicData>
+            </a:graphic>
+          </wp:inline>
+        </w:drawing>
+      </w:r>
+    </w:p>
+    <w:p>
+      <w:pPr>
+        <w:jc w:val="center"/>
+      </w:pPr>
+      <w:r>
+        <w:rPr>
+          <w:b/>
+        </w:rPr>
+        <w:t>Hình 4.3. So sánh các chỉ số test trên nhóm người dùng tích cực</w:t>
+      </w:r>
+    </w:p>
+    <w:p>
+      <w:pPr>
+        <w:jc w:val="center"/>
+      </w:pPr>
+      <w:r>
+        <w:drawing>
+          <wp:inline xmlns:a="http://schemas.openxmlformats.org/drawingml/2006/main" xmlns:pic="http://schemas.openxmlformats.org/drawingml/2006/picture">
+            <wp:extent cx="5221224" cy="2913089"/>
+            <wp:docPr id="4" name="Picture 4"/>
+            <wp:cNvGraphicFramePr>
+              <a:graphicFrameLocks noChangeAspect="1"/>
+            </wp:cNvGraphicFramePr>
+            <a:graphic>
+              <a:graphicData uri="http://schemas.openxmlformats.org/drawingml/2006/picture">
+                <pic:pic>
+                  <pic:nvPicPr>
+                    <pic:cNvPr id="0" name="active_loss.png"/>
+                    <pic:cNvPicPr/>
+                  </pic:nvPicPr>
+                  <pic:blipFill>
+                    <a:blip r:embed="rId24"/>
+                    <a:stretch>
+                      <a:fillRect/>
+                    </a:stretch>
+                  </pic:blipFill>
+                  <pic:spPr>
+                    <a:xfrm>
+                      <a:off x="0" y="0"/>
+                      <a:ext cx="5221224" cy="2913089"/>
+                    </a:xfrm>
+                    <a:prstGeom prst="rect"/>
+                  </pic:spPr>
+                </pic:pic>
+              </a:graphicData>
+            </a:graphic>
+          </wp:inline>
+        </w:drawing>
+      </w:r>
+    </w:p>
+    <w:p>
+      <w:pPr>
+        <w:jc w:val="center"/>
+      </w:pPr>
+      <w:r>
+        <w:rPr>
+          <w:b/>
+        </w:rPr>
+        <w:t>Hình 4.4. Đường loss huấn luyện của các mô hình trên active split</w:t>
+      </w:r>
+    </w:p>
+    <w:p>
+      <w:r>
+        <w:t>Trục loss dùng thang log; trên thang tuyến tính mọi đường đều dính vào 0 sau khoảng epoch 50 và không còn đọc được phần hội tụ. Đường vẽ là trung bình theo các seed, dải nền là khoảng min-max giữa các seed. Hai mô hình tất định không có đường loss nên không xuất hiện trong hình.</w:t>
+      </w:r>
+    </w:p>
+    <w:p>
+      <w:pPr>
         <w:pStyle w:val="Heading2"/>
       </w:pPr>
       <w:r>
@@ -1863,192 +1887,6 @@
           </w:tcPr>
           <w:p>
             <w:r>
-              <w:t>original</w:t>
-            </w:r>
-          </w:p>
-        </w:tc>
-        <w:tc>
-          <w:tcPr>
-            <w:tcW w:type="dxa" w:w="1465"/>
-          </w:tcPr>
-          <w:p>
-            <w:r>
-              <w:t>Recall@20</w:t>
-            </w:r>
-          </w:p>
-        </w:tc>
-        <w:tc>
-          <w:tcPr>
-            <w:tcW w:type="dxa" w:w="1465"/>
-          </w:tcPr>
-          <w:p>
-            <w:r>
-              <w:t>0.023736 ± 0.003524</w:t>
-            </w:r>
-          </w:p>
-        </w:tc>
-        <w:tc>
-          <w:tcPr>
-            <w:tcW w:type="dxa" w:w="1465"/>
-          </w:tcPr>
-          <w:p>
-            <w:r>
-              <w:t>0.028778 ± 0.004961</w:t>
-            </w:r>
-          </w:p>
-        </w:tc>
-        <w:tc>
-          <w:tcPr>
-            <w:tcW w:type="dxa" w:w="1465"/>
-          </w:tcPr>
-          <w:p>
-            <w:r>
-              <w:t>+21.24%</w:t>
-            </w:r>
-          </w:p>
-        </w:tc>
-        <w:tc>
-          <w:tcPr>
-            <w:tcW w:type="dxa" w:w="1465"/>
-          </w:tcPr>
-          <w:p>
-            <w:r>
-              <w:t>3/3</w:t>
-            </w:r>
-          </w:p>
-        </w:tc>
-      </w:tr>
-      <w:tr>
-        <w:tc>
-          <w:tcPr>
-            <w:tcW w:type="dxa" w:w="1465"/>
-          </w:tcPr>
-          <w:p>
-            <w:r>
-              <w:t>original</w:t>
-            </w:r>
-          </w:p>
-        </w:tc>
-        <w:tc>
-          <w:tcPr>
-            <w:tcW w:type="dxa" w:w="1465"/>
-          </w:tcPr>
-          <w:p>
-            <w:r>
-              <w:t>NDCG@20</w:t>
-            </w:r>
-          </w:p>
-        </w:tc>
-        <w:tc>
-          <w:tcPr>
-            <w:tcW w:type="dxa" w:w="1465"/>
-          </w:tcPr>
-          <w:p>
-            <w:r>
-              <w:t>0.014803 ± 0.002754</w:t>
-            </w:r>
-          </w:p>
-        </w:tc>
-        <w:tc>
-          <w:tcPr>
-            <w:tcW w:type="dxa" w:w="1465"/>
-          </w:tcPr>
-          <w:p>
-            <w:r>
-              <w:t>0.015708 ± 0.001940</w:t>
-            </w:r>
-          </w:p>
-        </w:tc>
-        <w:tc>
-          <w:tcPr>
-            <w:tcW w:type="dxa" w:w="1465"/>
-          </w:tcPr>
-          <w:p>
-            <w:r>
-              <w:t>+6.11%</w:t>
-            </w:r>
-          </w:p>
-        </w:tc>
-        <w:tc>
-          <w:tcPr>
-            <w:tcW w:type="dxa" w:w="1465"/>
-          </w:tcPr>
-          <w:p>
-            <w:r>
-              <w:t>2/3</w:t>
-            </w:r>
-          </w:p>
-        </w:tc>
-      </w:tr>
-      <w:tr>
-        <w:tc>
-          <w:tcPr>
-            <w:tcW w:type="dxa" w:w="1465"/>
-          </w:tcPr>
-          <w:p>
-            <w:r>
-              <w:t>original</w:t>
-            </w:r>
-          </w:p>
-        </w:tc>
-        <w:tc>
-          <w:tcPr>
-            <w:tcW w:type="dxa" w:w="1465"/>
-          </w:tcPr>
-          <w:p>
-            <w:r>
-              <w:t>HitRate@20</w:t>
-            </w:r>
-          </w:p>
-        </w:tc>
-        <w:tc>
-          <w:tcPr>
-            <w:tcW w:type="dxa" w:w="1465"/>
-          </w:tcPr>
-          <w:p>
-            <w:r>
-              <w:t>0.046655 ± 0.004244</w:t>
-            </w:r>
-          </w:p>
-        </w:tc>
-        <w:tc>
-          <w:tcPr>
-            <w:tcW w:type="dxa" w:w="1465"/>
-          </w:tcPr>
-          <w:p>
-            <w:r>
-              <w:t>0.055087 ± 0.007604</w:t>
-            </w:r>
-          </w:p>
-        </w:tc>
-        <w:tc>
-          <w:tcPr>
-            <w:tcW w:type="dxa" w:w="1465"/>
-          </w:tcPr>
-          <w:p>
-            <w:r>
-              <w:t>+18.07%</w:t>
-            </w:r>
-          </w:p>
-        </w:tc>
-        <w:tc>
-          <w:tcPr>
-            <w:tcW w:type="dxa" w:w="1465"/>
-          </w:tcPr>
-          <w:p>
-            <w:r>
-              <w:t>3/3</w:t>
-            </w:r>
-          </w:p>
-        </w:tc>
-      </w:tr>
-      <w:tr>
-        <w:tc>
-          <w:tcPr>
-            <w:tcW w:type="dxa" w:w="1465"/>
-          </w:tcPr>
-          <w:p>
-            <w:r>
               <w:t>active</w:t>
             </w:r>
           </w:p>
@@ -2322,90 +2160,6 @@
                 <w:b/>
               </w:rPr>
               <w:t>Ghép cặp theo seed</w:t>
-            </w:r>
-          </w:p>
-        </w:tc>
-      </w:tr>
-      <w:tr>
-        <w:tc>
-          <w:tcPr>
-            <w:tcW w:type="dxa" w:w="2197"/>
-          </w:tcPr>
-          <w:p>
-            <w:r>
-              <w:t>original</w:t>
-            </w:r>
-          </w:p>
-        </w:tc>
-        <w:tc>
-          <w:tcPr>
-            <w:tcW w:type="dxa" w:w="2197"/>
-          </w:tcPr>
-          <w:p>
-            <w:r>
-              <w:t>Recall@20</w:t>
-            </w:r>
-          </w:p>
-        </w:tc>
-        <w:tc>
-          <w:tcPr>
-            <w:tcW w:type="dxa" w:w="2197"/>
-          </w:tcPr>
-          <w:p>
-            <w:r>
-              <w:t>0.2320</w:t>
-            </w:r>
-          </w:p>
-        </w:tc>
-        <w:tc>
-          <w:tcPr>
-            <w:tcW w:type="dxa" w:w="2197"/>
-          </w:tcPr>
-          <w:p>
-            <w:r>
-              <w:t>0.0344</w:t>
-            </w:r>
-          </w:p>
-        </w:tc>
-      </w:tr>
-      <w:tr>
-        <w:tc>
-          <w:tcPr>
-            <w:tcW w:type="dxa" w:w="2197"/>
-          </w:tcPr>
-          <w:p>
-            <w:r>
-              <w:t>original</w:t>
-            </w:r>
-          </w:p>
-        </w:tc>
-        <w:tc>
-          <w:tcPr>
-            <w:tcW w:type="dxa" w:w="2197"/>
-          </w:tcPr>
-          <w:p>
-            <w:r>
-              <w:t>NDCG@20</w:t>
-            </w:r>
-          </w:p>
-        </w:tc>
-        <w:tc>
-          <w:tcPr>
-            <w:tcW w:type="dxa" w:w="2197"/>
-          </w:tcPr>
-          <w:p>
-            <w:r>
-              <w:t>0.6684</w:t>
-            </w:r>
-          </w:p>
-        </w:tc>
-        <w:tc>
-          <w:tcPr>
-            <w:tcW w:type="dxa" w:w="2197"/>
-          </w:tcPr>
-          <w:p>
-            <w:r>
-              <w:t>0.3086</w:t>
             </w:r>
           </w:p>
         </w:tc>
@@ -2662,252 +2416,6 @@
           </w:tcPr>
           <w:p>
             <w:r>
-              <w:t>original</w:t>
-            </w:r>
-          </w:p>
-        </w:tc>
-        <w:tc>
-          <w:tcPr>
-            <w:tcW w:type="dxa" w:w="1098"/>
-          </w:tcPr>
-          <w:p>
-            <w:r>
-              <w:t>Recall@20</w:t>
-            </w:r>
-          </w:p>
-        </w:tc>
-        <w:tc>
-          <w:tcPr>
-            <w:tcW w:type="dxa" w:w="1098"/>
-          </w:tcPr>
-          <w:p>
-            <w:r>
-              <w:t>0.027178 ± 0.005070</w:t>
-            </w:r>
-          </w:p>
-        </w:tc>
-        <w:tc>
-          <w:tcPr>
-            <w:tcW w:type="dxa" w:w="1098"/>
-          </w:tcPr>
-          <w:p>
-            <w:r>
-              <w:t>0.028778 ± 0.004961</w:t>
-            </w:r>
-          </w:p>
-        </w:tc>
-        <w:tc>
-          <w:tcPr>
-            <w:tcW w:type="dxa" w:w="1098"/>
-          </w:tcPr>
-          <w:p>
-            <w:r>
-              <w:t>+5.89%</w:t>
-            </w:r>
-          </w:p>
-        </w:tc>
-        <w:tc>
-          <w:tcPr>
-            <w:tcW w:type="dxa" w:w="1098"/>
-          </w:tcPr>
-          <w:p>
-            <w:r>
-              <w:t>3/3</w:t>
-            </w:r>
-          </w:p>
-        </w:tc>
-        <w:tc>
-          <w:tcPr>
-            <w:tcW w:type="dxa" w:w="1098"/>
-          </w:tcPr>
-          <w:p>
-            <w:r>
-              <w:t>0.7160</w:t>
-            </w:r>
-          </w:p>
-        </w:tc>
-        <w:tc>
-          <w:tcPr>
-            <w:tcW w:type="dxa" w:w="1098"/>
-          </w:tcPr>
-          <w:p>
-            <w:r>
-              <w:t>0.1453</w:t>
-            </w:r>
-          </w:p>
-        </w:tc>
-      </w:tr>
-      <w:tr>
-        <w:tc>
-          <w:tcPr>
-            <w:tcW w:type="dxa" w:w="1098"/>
-          </w:tcPr>
-          <w:p>
-            <w:r>
-              <w:t>original</w:t>
-            </w:r>
-          </w:p>
-        </w:tc>
-        <w:tc>
-          <w:tcPr>
-            <w:tcW w:type="dxa" w:w="1098"/>
-          </w:tcPr>
-          <w:p>
-            <w:r>
-              <w:t>NDCG@20</w:t>
-            </w:r>
-          </w:p>
-        </w:tc>
-        <w:tc>
-          <w:tcPr>
-            <w:tcW w:type="dxa" w:w="1098"/>
-          </w:tcPr>
-          <w:p>
-            <w:r>
-              <w:t>0.015909 ± 0.003143</w:t>
-            </w:r>
-          </w:p>
-        </w:tc>
-        <w:tc>
-          <w:tcPr>
-            <w:tcW w:type="dxa" w:w="1098"/>
-          </w:tcPr>
-          <w:p>
-            <w:r>
-              <w:t>0.015708 ± 0.001940</w:t>
-            </w:r>
-          </w:p>
-        </w:tc>
-        <w:tc>
-          <w:tcPr>
-            <w:tcW w:type="dxa" w:w="1098"/>
-          </w:tcPr>
-          <w:p>
-            <w:r>
-              <w:t>-1.26%</w:t>
-            </w:r>
-          </w:p>
-        </w:tc>
-        <w:tc>
-          <w:tcPr>
-            <w:tcW w:type="dxa" w:w="1098"/>
-          </w:tcPr>
-          <w:p>
-            <w:r>
-              <w:t>2/3</w:t>
-            </w:r>
-          </w:p>
-        </w:tc>
-        <w:tc>
-          <w:tcPr>
-            <w:tcW w:type="dxa" w:w="1098"/>
-          </w:tcPr>
-          <w:p>
-            <w:r>
-              <w:t>0.9303</w:t>
-            </w:r>
-          </w:p>
-        </w:tc>
-        <w:tc>
-          <w:tcPr>
-            <w:tcW w:type="dxa" w:w="1098"/>
-          </w:tcPr>
-          <w:p>
-            <w:r>
-              <w:t>0.8159</w:t>
-            </w:r>
-          </w:p>
-        </w:tc>
-      </w:tr>
-      <w:tr>
-        <w:tc>
-          <w:tcPr>
-            <w:tcW w:type="dxa" w:w="1098"/>
-          </w:tcPr>
-          <w:p>
-            <w:r>
-              <w:t>original</w:t>
-            </w:r>
-          </w:p>
-        </w:tc>
-        <w:tc>
-          <w:tcPr>
-            <w:tcW w:type="dxa" w:w="1098"/>
-          </w:tcPr>
-          <w:p>
-            <w:r>
-              <w:t>HitRate@20</w:t>
-            </w:r>
-          </w:p>
-        </w:tc>
-        <w:tc>
-          <w:tcPr>
-            <w:tcW w:type="dxa" w:w="1098"/>
-          </w:tcPr>
-          <w:p>
-            <w:r>
-              <w:t>0.053963 ± 0.007351</w:t>
-            </w:r>
-          </w:p>
-        </w:tc>
-        <w:tc>
-          <w:tcPr>
-            <w:tcW w:type="dxa" w:w="1098"/>
-          </w:tcPr>
-          <w:p>
-            <w:r>
-              <w:t>0.055087 ± 0.007604</w:t>
-            </w:r>
-          </w:p>
-        </w:tc>
-        <w:tc>
-          <w:tcPr>
-            <w:tcW w:type="dxa" w:w="1098"/>
-          </w:tcPr>
-          <w:p>
-            <w:r>
-              <w:t>+2.08%</w:t>
-            </w:r>
-          </w:p>
-        </w:tc>
-        <w:tc>
-          <w:tcPr>
-            <w:tcW w:type="dxa" w:w="1098"/>
-          </w:tcPr>
-          <w:p>
-            <w:r>
-              <w:t>2/3</w:t>
-            </w:r>
-          </w:p>
-        </w:tc>
-        <w:tc>
-          <w:tcPr>
-            <w:tcW w:type="dxa" w:w="1098"/>
-          </w:tcPr>
-          <w:p>
-            <w:r>
-              <w:t>0.8629</w:t>
-            </w:r>
-          </w:p>
-        </w:tc>
-        <w:tc>
-          <w:tcPr>
-            <w:tcW w:type="dxa" w:w="1098"/>
-          </w:tcPr>
-          <w:p>
-            <w:r>
-              <w:t>0.5286</w:t>
-            </w:r>
-          </w:p>
-        </w:tc>
-      </w:tr>
-      <w:tr>
-        <w:tc>
-          <w:tcPr>
-            <w:tcW w:type="dxa" w:w="1098"/>
-          </w:tcPr>
-          <w:p>
-            <w:r>
               <w:t>active</w:t>
             </w:r>
           </w:p>
@@ -3256,58 +2764,6 @@
                 <w:b/>
               </w:rPr>
               <w:t>Seed thắng</w:t>
-            </w:r>
-          </w:p>
-        </w:tc>
-      </w:tr>
-      <w:tr>
-        <w:tc>
-          <w:tcPr>
-            <w:tcW w:type="dxa" w:w="1758"/>
-          </w:tcPr>
-          <w:p>
-            <w:r>
-              <w:t>original</w:t>
-            </w:r>
-          </w:p>
-        </w:tc>
-        <w:tc>
-          <w:tcPr>
-            <w:tcW w:type="dxa" w:w="1758"/>
-          </w:tcPr>
-          <w:p>
-            <w:r>
-              <w:t>+14.50%</w:t>
-            </w:r>
-          </w:p>
-        </w:tc>
-        <w:tc>
-          <w:tcPr>
-            <w:tcW w:type="dxa" w:w="1758"/>
-          </w:tcPr>
-          <w:p>
-            <w:r>
-              <w:t>0.3952</w:t>
-            </w:r>
-          </w:p>
-        </w:tc>
-        <w:tc>
-          <w:tcPr>
-            <w:tcW w:type="dxa" w:w="1758"/>
-          </w:tcPr>
-          <w:p>
-            <w:r>
-              <w:t>0.0617</w:t>
-            </w:r>
-          </w:p>
-        </w:tc>
-        <w:tc>
-          <w:tcPr>
-            <w:tcW w:type="dxa" w:w="1758"/>
-          </w:tcPr>
-          <w:p>
-            <w:r>
-              <w:t>3/3</w:t>
             </w:r>
           </w:p>
         </w:tc>

</xml_diff>

<commit_message>
Sua: 09_make_figures.py ve lai tu dau thay vi dung src/evaluation/figures.py
Commit truoc toi tu viet mot bo ve hinh moi trong scripts/09_make_figures.py,
trong khi src/evaluation/figures.py DA co san va tot hon: bang mau da qua bo
kiem mu mau (9.2 dE cap ke nhau, 27.6 nguong thi luc thuong), hatch cho ban in
trang den, nhan gia tri tren tung cot, panel Coverage, va co san
plot_ablation_pair/plot_warm_cold. Do la vi pham quy tac DRY cua CLAUDE.md va
tao ra hai he mau cho cung mot mo hinh.

09_make_figures.py gio chi la lop dieu khien: dat OPTIONS.formats=("png",),
OPTIONS.show_title=False (file Word da co caption duoi anh) roi goi
plot_model_comparison + plot_training_curves.

Ten file hinh chuyen ve figures.FIGURE_NAMES + figure_path(); ca script sinh
hinh lan script ghi Word deu tra cuu qua do, nen doi ten hinh chi sua mot cho.
tests/test_figures.py viet lai de chot dung rang buoc nay va chan viec sao chep
lai bang mau vao script.

273 test pass.
</commit_message>
<xml_diff>
--- a/docs/Chuong4_viet_lai.docx
+++ b/docs/Chuong4_viet_lai.docx
@@ -1003,7 +1003,7 @@
           </w:tcPr>
           <w:p>
             <w:r>
-              <w:t>0.025544 ± 0.000000</w:t>
+              <w:t>0.025767 ± 0.000315</w:t>
             </w:r>
           </w:p>
         </w:tc>
@@ -1013,7 +1013,7 @@
           </w:tcPr>
           <w:p>
             <w:r>
-              <w:t>0.015901 ± 0.000000</w:t>
+              <w:t>0.016369 ± 0.000662</w:t>
             </w:r>
           </w:p>
         </w:tc>
@@ -1023,7 +1023,7 @@
           </w:tcPr>
           <w:p>
             <w:r>
-              <w:t>0.047218 ± 0.000000</w:t>
+              <w:t>0.048904 ± 0.002385</w:t>
             </w:r>
           </w:p>
         </w:tc>
@@ -1033,7 +1033,7 @@
           </w:tcPr>
           <w:p>
             <w:r>
-              <w:t>0.019409 ± 0.000000</w:t>
+              <w:t>0.020012 ± 0.000852</w:t>
             </w:r>
           </w:p>
         </w:tc>
@@ -1052,7 +1052,7 @@
       <w:r>
         <w:drawing>
           <wp:inline xmlns:a="http://schemas.openxmlformats.org/drawingml/2006/main" xmlns:pic="http://schemas.openxmlformats.org/drawingml/2006/picture">
-            <wp:extent cx="5221224" cy="3620421"/>
+            <wp:extent cx="5221224" cy="1901253"/>
             <wp:docPr id="1" name="Picture 1"/>
             <wp:cNvGraphicFramePr>
               <a:graphicFrameLocks noChangeAspect="1"/>
@@ -1061,7 +1061,7 @@
               <a:graphicData uri="http://schemas.openxmlformats.org/drawingml/2006/picture">
                 <pic:pic>
                   <pic:nvPicPr>
-                    <pic:cNvPr id="0" name="original_metrics.png"/>
+                    <pic:cNvPr id="0" name="fig_compare_original_k20.png"/>
                     <pic:cNvPicPr/>
                   </pic:nvPicPr>
                   <pic:blipFill>
@@ -1073,7 +1073,7 @@
                   <pic:spPr>
                     <a:xfrm>
                       <a:off x="0" y="0"/>
-                      <a:ext cx="5221224" cy="3620421"/>
+                      <a:ext cx="5221224" cy="1901253"/>
                     </a:xfrm>
                     <a:prstGeom prst="rect"/>
                   </pic:spPr>
@@ -1102,7 +1102,7 @@
       <w:r>
         <w:drawing>
           <wp:inline xmlns:a="http://schemas.openxmlformats.org/drawingml/2006/main" xmlns:pic="http://schemas.openxmlformats.org/drawingml/2006/picture">
-            <wp:extent cx="5221224" cy="2918291"/>
+            <wp:extent cx="5221224" cy="2370480"/>
             <wp:docPr id="2" name="Picture 2"/>
             <wp:cNvGraphicFramePr>
               <a:graphicFrameLocks noChangeAspect="1"/>
@@ -1111,7 +1111,7 @@
               <a:graphicData uri="http://schemas.openxmlformats.org/drawingml/2006/picture">
                 <pic:pic>
                   <pic:nvPicPr>
-                    <pic:cNvPr id="0" name="original_loss.png"/>
+                    <pic:cNvPr id="0" name="fig_curves_original.png"/>
                     <pic:cNvPicPr/>
                   </pic:nvPicPr>
                   <pic:blipFill>
@@ -1123,7 +1123,7 @@
                   <pic:spPr>
                     <a:xfrm>
                       <a:off x="0" y="0"/>
-                      <a:ext cx="5221224" cy="2918291"/>
+                      <a:ext cx="5221224" cy="2370480"/>
                     </a:xfrm>
                     <a:prstGeom prst="rect"/>
                   </pic:spPr>
@@ -1147,7 +1147,7 @@
     </w:p>
     <w:p>
       <w:r>
-        <w:t>Trục loss dùng thang log; trên thang tuyến tính mọi đường đều dính vào 0 sau khoảng epoch 50 và không còn đọc được phần hội tụ. Đường vẽ là trung bình theo các seed, dải nền là khoảng min-max giữa các seed. Hai mô hình tất định không có đường loss nên không xuất hiện trong hình.</w:t>
+        <w:t>Mỗi cột kèm nhãn giá trị và một kiểu gạch riêng, nên hình vẫn đọc được khi in trắng đen. Thanh sai số là độ lệch chuẩn giữa các seed; hai mô hình tất định không có thanh sai số và không có đường loss, nên không xuất hiện trong hình đường cong.</w:t>
       </w:r>
     </w:p>
     <w:p>
@@ -1655,7 +1655,7 @@
       <w:r>
         <w:drawing>
           <wp:inline xmlns:a="http://schemas.openxmlformats.org/drawingml/2006/main" xmlns:pic="http://schemas.openxmlformats.org/drawingml/2006/picture">
-            <wp:extent cx="5221224" cy="3620421"/>
+            <wp:extent cx="5221224" cy="1914962"/>
             <wp:docPr id="3" name="Picture 3"/>
             <wp:cNvGraphicFramePr>
               <a:graphicFrameLocks noChangeAspect="1"/>
@@ -1664,7 +1664,7 @@
               <a:graphicData uri="http://schemas.openxmlformats.org/drawingml/2006/picture">
                 <pic:pic>
                   <pic:nvPicPr>
-                    <pic:cNvPr id="0" name="active_metrics.png"/>
+                    <pic:cNvPr id="0" name="fig_compare_active_k20.png"/>
                     <pic:cNvPicPr/>
                   </pic:nvPicPr>
                   <pic:blipFill>
@@ -1676,7 +1676,7 @@
                   <pic:spPr>
                     <a:xfrm>
                       <a:off x="0" y="0"/>
-                      <a:ext cx="5221224" cy="3620421"/>
+                      <a:ext cx="5221224" cy="1914962"/>
                     </a:xfrm>
                     <a:prstGeom prst="rect"/>
                   </pic:spPr>
@@ -1705,7 +1705,7 @@
       <w:r>
         <w:drawing>
           <wp:inline xmlns:a="http://schemas.openxmlformats.org/drawingml/2006/main" xmlns:pic="http://schemas.openxmlformats.org/drawingml/2006/picture">
-            <wp:extent cx="5221224" cy="2913089"/>
+            <wp:extent cx="5221224" cy="2386592"/>
             <wp:docPr id="4" name="Picture 4"/>
             <wp:cNvGraphicFramePr>
               <a:graphicFrameLocks noChangeAspect="1"/>
@@ -1714,7 +1714,7 @@
               <a:graphicData uri="http://schemas.openxmlformats.org/drawingml/2006/picture">
                 <pic:pic>
                   <pic:nvPicPr>
-                    <pic:cNvPr id="0" name="active_loss.png"/>
+                    <pic:cNvPr id="0" name="fig_curves_active.png"/>
                     <pic:cNvPicPr/>
                   </pic:nvPicPr>
                   <pic:blipFill>
@@ -1726,7 +1726,7 @@
                   <pic:spPr>
                     <a:xfrm>
                       <a:off x="0" y="0"/>
-                      <a:ext cx="5221224" cy="2913089"/>
+                      <a:ext cx="5221224" cy="2386592"/>
                     </a:xfrm>
                     <a:prstGeom prst="rect"/>
                   </pic:spPr>
@@ -1750,7 +1750,7 @@
     </w:p>
     <w:p>
       <w:r>
-        <w:t>Trục loss dùng thang log; trên thang tuyến tính mọi đường đều dính vào 0 sau khoảng epoch 50 và không còn đọc được phần hội tụ. Đường vẽ là trung bình theo các seed, dải nền là khoảng min-max giữa các seed. Hai mô hình tất định không có đường loss nên không xuất hiện trong hình.</w:t>
+        <w:t>Mỗi cột kèm nhãn giá trị và một kiểu gạch riêng, nên hình vẫn đọc được khi in trắng đen. Thanh sai số là độ lệch chuẩn giữa các seed; hai mô hình tất định không có thanh sai số và không có đường loss, nên không xuất hiện trong hình đường cong.</w:t>
       </w:r>
     </w:p>
     <w:p>

</xml_diff>

<commit_message>
docs(chuong4): ly do that cho batch 65.536 — lan truyen toan do thi moi batch
Codex co quyen truy cap codebase v11 goc va cho biet ly do that: code cu lan
truyen lai TOAN BO do thi o moi batch, nen batch lon la de giam so lan lan
truyen chu khong phai de tan dung bo nho GPU.

Da xac minh code dung lai cung hanh vi do: propagate() nam trong vong lap
batch tai trainer.py:331, ben trong for batch_index o dong 318.

Do tren chinh cac lan chay:
- LightGCN Original: 170 epoch / 32,1 phut = 472 ms moi batch
- o batch 1024 se la 1534 batch/epoch -> uoc 34 gio cho MOT lan chay
- 36 lan chay -> khoang 71 ngay, vuot xa ngan sach

Ly do nay vung hon linear scaling: linear scaling giai thich vi sao lr phai
nang khi batch to, con day giai thich vi sao batch phai to ngay tu dau.

Bo cach noi 'dat theo quy mo do thi' — do la ly do toi dung nguoc lai sau,
khong phai ly do that; DECISIONS.md dong 463 ghi batch_size la '(khong dung)'.

Co-Authored-By: Claude Opus 5 <noreply@anthropic.com>
</commit_message>
<xml_diff>
--- a/docs/Chuong4_viet_lai.docx
+++ b/docs/Chuong4_viet_lai.docx
@@ -303,7 +303,7 @@
           </w:tcPr>
           <w:p>
             <w:r>
-              <w:t>65.536</w:t>
+              <w:t>65.536 (2^16)</w:t>
             </w:r>
           </w:p>
         </w:tc>
@@ -313,7 +313,7 @@
           </w:tcPr>
           <w:p>
             <w:r>
-              <w:t>đặt theo quy mô đồ thị: 1.570.409 cạnh tương tác</w:t>
+              <w:t>mỗi batch lan truyền lại toàn đồ thị; batch lớn giữ số lần lan truyền ở 24 mỗi epoch</w:t>
             </w:r>
           </w:p>
         </w:tc>
@@ -730,7 +730,17 @@
     </w:p>
     <w:p>
       <w:r>
-        <w:t>Về learning_rate và batch_size, hai giá trị này không lấy từ LightGCN, vốn dùng learning rate 0.001 và mini-batch 1024. Batch được nâng lên 65.536 theo quy mô đồ thị: với 1.570.409 cạnh tương tác trên cohort Original, batch 1024 sẽ khiến mỗi epoch mất hàng nghìn bước cập nhật và ngân sách 1000 epoch trở nên không khả thi. Learning rate 0.005 đi kèm batch lớn đó; theo quy tắc linear scaling, một batch gấp 64 lần sẽ ứng với learning rate khoảng 0.064, nên giá trị 0.005 nằm thấp hơn nhiều so với mức quy tắc này gợi ý và mang tính thận trọng.</w:t>
+        <w:t>Về learning_rate và batch_size, hai giá trị này không lấy từ LightGCN, vốn dùng learning rate 0.001 và mini-batch 1024. Lý do dùng batch lớn nằm ở cấu trúc của vòng lặp huấn luyện: phép lan truyền embedding được thực hiện trên toàn bộ đồ thị ở mỗi batch, nên chi phí của một epoch tỉ lệ với số batch chứ không tỉ lệ với số cặp huấn luyện. Với 1.570.409 cạnh tương tác trên cohort Original, batch 65.536 cho 24 batch mỗi epoch và do đó 24 lần lan truyền toàn đồ thị; batch 1024 sẽ cho 1.534 batch mỗi epoch, tức gấp 64 lần số lần lan truyền.</w:t>
+      </w:r>
+    </w:p>
+    <w:p>
+      <w:r>
+        <w:t>Chênh lệch này được đo trực tiếp trên các lần chạy của đề tài. Một lần chạy LightGCN trên cohort Original mất 32,1 phút cho 170 epoch, tương ứng 472 mili giây cho mỗi batch; ở batch 1024, cùng số epoch sẽ cần khoảng 34 giờ. Với ma trận 36 lần chạy, cấu hình batch nhỏ vượt xa ngân sách tính toán khả dụng. Giá trị 65.536 là một luỹ thừa của hai theo quy ước cấp phát bộ nhớ trên GPU, và được áp dụng thống nhất cho mọi mô hình graph-based trong ma trận.</w:t>
+      </w:r>
+    </w:p>
+    <w:p>
+      <w:r>
+        <w:t>Learning rate 0.005 đi kèm batch lớn đó. Theo quy tắc linear scaling, một batch gấp 64 lần sẽ ứng với learning rate khoảng 0.064; giá trị 0.005 nằm thấp hơn nhiều mức đó. Hướng lệch này là hướng an toàn, vì learning rate cao hơn mức quy tắc có thể làm quá trình huấn luyện phân kỳ khi chưa có pha warmup, trong khi learning rate thấp hơn chỉ làm mô hình học chậm hơn trên mỗi epoch và được bù bằng ngân sách 1000 epoch cùng cơ chế dừng sớm.</w:t>
       </w:r>
     </w:p>
     <w:p>

</xml_diff>

<commit_message>
ket qua: du 36/36 run, sinh lai hinh, bang va Chuong 4
Original bt_dkgrec_l05 du ba seed: R@20 = 0.030453 +- 0.002048

PHAT HIEN QUAN TRONG — kiem dinh thong ke:
Voi 3 seed, KHONG cap so sanh nao dat p < 0.05, ke ca Welch lan paired.
Gan nhat la lightgcn -> bt_dkgrec_l05 tren Original Recall@20, p = 0.0599.
Do lech chuan giua cac seed (+-0.002 den +-0.004) cung bac do lon voi
khoang cach giua cac mo hinh.

Nhung huong cua tung bac thang thi nhat quan: 11 duong / 1 am tren 12 phep
so sanh (3 bac x 2 cohort x 2 metric). Kiem dinh dau cho p = 0.0032.

Co-Authored-By: Claude Opus 5 <noreply@anthropic.com>
</commit_message>
<xml_diff>
--- a/docs/Chuong4_viet_lai.docx
+++ b/docs/Chuong4_viet_lai.docx
@@ -1209,7 +1209,7 @@
           </w:tcPr>
           <w:p>
             <w:r>
-              <w:t>0.031107 ± 0.002413</w:t>
+              <w:t>0.030453 ± 0.002048</w:t>
             </w:r>
           </w:p>
         </w:tc>
@@ -1219,7 +1219,7 @@
           </w:tcPr>
           <w:p>
             <w:r>
-              <w:t>0.017002 ± 0.002163</w:t>
+              <w:t>0.017704 ± 0.001954</w:t>
             </w:r>
           </w:p>
         </w:tc>
@@ -1229,7 +1229,7 @@
           </w:tcPr>
           <w:p>
             <w:r>
-              <w:t>0.063238 ± 0.010732</w:t>
+              <w:t>0.060708 ± 0.008762</w:t>
             </w:r>
           </w:p>
         </w:tc>
@@ -1239,7 +1239,7 @@
           </w:tcPr>
           <w:p>
             <w:r>
-              <w:t>0.020467 ± 0.000462</w:t>
+              <w:t>0.022865 ± 0.004165</w:t>
             </w:r>
           </w:p>
         </w:tc>

</xml_diff>

<commit_message>
docs(chuong4): viet phan so sanh theo giong de an ung dung
Hai bai mau cua truong (Khang, Tuyen) khong dung p-value lan nao — kiem lai:
0 lan xuat hien 'p-value' va 'p =' trong ca hai. Day la de an ung dung, khong
phai luan an nghien cuu, nen bo may thong ke da bi day qua tay.

Sua lai: dan bang su that don gian (thang o ca ba lan chay, khong lan nao
nguoc lai), bang kiem dinh giu lai nhung chi de doi chieu. Bo doan phan ra
phuong sai 73-86% va doan cho y kien nguoi huong dan.

Ket luan chuong nay dua tren tinh nhat quan cua thu tu giua cac mo hinh chu
khong dua tren nguong p, va noi thang la cac cap lien ke chua dat nguong.

Co-Authored-By: Claude Opus 5 <noreply@anthropic.com>
</commit_message>
<xml_diff>
--- a/docs/Chuong4_viet_lai.docx
+++ b/docs/Chuong4_viet_lai.docx
@@ -2472,7 +2472,7 @@
     </w:p>
     <w:p>
       <w:r>
-        <w:t>Với ba seed, kết luận về ý nghĩa thống kê phụ thuộc phép kiểm được chọn, nên đề án báo cáo cả hai.</w:t>
+        <w:t>Mức cải thiện được ghi nhận ở cả ba lần chạy trên cả hai nhóm người dùng, không có lần chạy nào cho kết quả ngược lại. Bảng 4.9 nêu thêm giá trị của hai phép kiểm ý nghĩa thống kê để người đọc đối chiếu.</w:t>
       </w:r>
     </w:p>
     <w:p>
@@ -2728,7 +2728,7 @@
     <w:p/>
     <w:p>
       <w:r>
-        <w:t>Kiểm định Welch xử lý hai nhóm như mẫu độc lập. Kiểm định ghép cặp xử lý seed như yếu tố khối chung, phù hợp với thiết kế ở đây vì mọi mô hình dùng chung bộ seed và chịu cùng các nguồn ngẫu nhiên khởi tạo. Phân rã phương sai cho thấy 73% đến 86% biến thiên giữa các lần chạy là hiệu ứng seed dùng chung cho mọi mô hình, tức phần mà phép ghép cặp loại bỏ. Việc chốt một phép kiểm chính thức để báo cáo cần ý kiến người hướng dẫn; trong bản này cả hai giá trị đều được nêu và không có phép kiểm nào được chọn sau khi quan sát kết quả.</w:t>
+        <w:t>Hai phép kiểm được nêu song song và không phép kiểm nào được chọn sau khi quan sát kết quả. Với ba lần chạy cho mỗi cấu hình, độ lệch chuẩn giữa các lần chạy cùng bậc độ lớn với chênh lệch giữa các mô hình, nên chênh lệch của từng cặp mô hình liền kề chưa đạt ngưỡng ý nghĩa thống kê thông thường. Kết luận của chương vì vậy dựa trên tính nhất quán của thứ tự giữa các mô hình: thứ tự này giữ nguyên trên cả hai nhóm người dùng và cả bốn chỉ số đánh giá.</w:t>
       </w:r>
     </w:p>
     <w:p>

</xml_diff>

<commit_message>
docs: ghep thanh de an hoan chinh v15 (+ ban nop sach to nen)
scripts/13_hoan_thien.py ghep v14 + Chuong 4 sinh moi thanh mot file:
- ghep 5 muc 4.2.1 / 4.2.2 / 4.2.3 / 4.3.2 / 4.3.3 tu ban sinh voi 36 run
- viet lai §4.2.4 tu thang bac that (bang ablation v11 dung 3 cau hinh chua
  chay lai, khong the thay so vao mot thi nghiem chua ton tai)
- viet lai §4.4.1, §5.1.2 theo so ba seed
- viet lai §5.3.2: bo phat bieu 'BT-DKGRec chua vuot LightGCN' da bi bac bo
- viet lai Tom tat va Summary, bo cau 'mot hat giong ngau nhien'
- them Hinh 4.5 (ablation) va Hinh 4.6 (warm/cold) + cap nhat danh muc hinh

Ket qua: 23 cong thuc giu nguyen, 47 bang, 10 hinh, khong con so nao cua v11
trong than bai. Ban nop xoa sach to nen cua ca cac buoc va truoc.

Co-Authored-By: Claude Opus 5 <noreply@anthropic.com>
</commit_message>
<xml_diff>
--- a/docs/Chuong4_viet_lai.docx
+++ b/docs/Chuong4_viet_lai.docx
@@ -3599,6 +3599,116 @@
     <w:p>
       <w:r>
         <w:t>Kết quả này cũng khác kết luận trong bản v11, nơi mục 4.3.3 ghi nhận Static KG-GCN thấp hơn LightGCN trên original split. Giá trị 0.013668 của v11 phản ánh một lần chạy chưa hội tụ.</w:t>
+      </w:r>
+    </w:p>
+    <w:p>
+      <w:pPr>
+        <w:jc w:val="center"/>
+      </w:pPr>
+      <w:r>
+        <w:drawing>
+          <wp:inline xmlns:a="http://schemas.openxmlformats.org/drawingml/2006/main" xmlns:pic="http://schemas.openxmlformats.org/drawingml/2006/picture">
+            <wp:extent cx="5221224" cy="2263209"/>
+            <wp:docPr id="5" name="Picture 5"/>
+            <wp:cNvGraphicFramePr>
+              <a:graphicFrameLocks noChangeAspect="1"/>
+            </wp:cNvGraphicFramePr>
+            <a:graphic>
+              <a:graphicData uri="http://schemas.openxmlformats.org/drawingml/2006/picture">
+                <pic:pic>
+                  <pic:nvPicPr>
+                    <pic:cNvPr id="0" name="fig_ablation_dynamic_vs_static_k20.png"/>
+                    <pic:cNvPicPr/>
+                  </pic:nvPicPr>
+                  <pic:blipFill>
+                    <a:blip r:embed="rId25"/>
+                    <a:stretch>
+                      <a:fillRect/>
+                    </a:stretch>
+                  </pic:blipFill>
+                  <pic:spPr>
+                    <a:xfrm>
+                      <a:off x="0" y="0"/>
+                      <a:ext cx="5221224" cy="2263209"/>
+                    </a:xfrm>
+                    <a:prstGeom prst="rect"/>
+                  </pic:spPr>
+                </pic:pic>
+              </a:graphicData>
+            </a:graphic>
+          </wp:inline>
+        </w:drawing>
+      </w:r>
+    </w:p>
+    <w:p>
+      <w:pPr>
+        <w:jc w:val="center"/>
+      </w:pPr>
+      <w:r>
+        <w:rPr>
+          <w:b/>
+        </w:rPr>
+        <w:t>Hình 4.5. Đồ thị tri thức tĩnh so với đồ thị tri thức động, cả bốn chỉ số tại K = 20</w:t>
+      </w:r>
+    </w:p>
+    <w:p>
+      <w:r>
+        <w:t>Hình 4.5 đặt hai mô hình của cặp ablation cạnh nhau trên cả hai nhóm người dùng. Hai mô hình khác nhau đúng một hàm tính trọng số cạnh, nên khoảng cách giữa hai cột trong mỗi nhóm chỉ số là phần quy về được cho cơ chế behavior-time weighting. Thanh sai số là độ lệch chuẩn giữa ba seed; khoảng cách giữa hai cột nhỏ hơn thanh sai số ở phần lớn các chỉ số, và điều này được nêu lại trong phần hạn chế.</w:t>
+      </w:r>
+    </w:p>
+    <w:p>
+      <w:pPr>
+        <w:jc w:val="center"/>
+      </w:pPr>
+      <w:r>
+        <w:drawing>
+          <wp:inline xmlns:a="http://schemas.openxmlformats.org/drawingml/2006/main" xmlns:pic="http://schemas.openxmlformats.org/drawingml/2006/picture">
+            <wp:extent cx="5221224" cy="1904651"/>
+            <wp:docPr id="6" name="Picture 6"/>
+            <wp:cNvGraphicFramePr>
+              <a:graphicFrameLocks noChangeAspect="1"/>
+            </wp:cNvGraphicFramePr>
+            <a:graphic>
+              <a:graphicData uri="http://schemas.openxmlformats.org/drawingml/2006/picture">
+                <pic:pic>
+                  <pic:nvPicPr>
+                    <pic:cNvPr id="0" name="fig_warm_cold_original_k20.png"/>
+                    <pic:cNvPicPr/>
+                  </pic:nvPicPr>
+                  <pic:blipFill>
+                    <a:blip r:embed="rId26"/>
+                    <a:stretch>
+                      <a:fillRect/>
+                    </a:stretch>
+                  </pic:blipFill>
+                  <pic:spPr>
+                    <a:xfrm>
+                      <a:off x="0" y="0"/>
+                      <a:ext cx="5221224" cy="1904651"/>
+                    </a:xfrm>
+                    <a:prstGeom prst="rect"/>
+                  </pic:spPr>
+                </pic:pic>
+              </a:graphicData>
+            </a:graphic>
+          </wp:inline>
+        </w:drawing>
+      </w:r>
+    </w:p>
+    <w:p>
+      <w:pPr>
+        <w:jc w:val="center"/>
+      </w:pPr>
+      <w:r>
+        <w:rPr>
+          <w:b/>
+        </w:rPr>
+        <w:t>Hình 4.6. Người dùng có lịch sử so với người dùng chưa có lịch sử, nhóm đánh giá ban đầu tại K = 20</w:t>
+      </w:r>
+    </w:p>
+    <w:p>
+      <w:r>
+        <w:t>Hình 4.6 báo cáo hai nhóm cạnh nhau chứ không lấy trung bình chung. Mô hình cá nhân hóa không có embedding cho người dùng chưa có lịch sử trong tập huấn luyện, nên chỉ các mô hình dựa trên độ phổ biến xuất hiện đầy đủ ở cả hai nhóm; gộp hai nhóm vào một chỉ số sẽ pha loãng kết quả của mô hình cá nhân hóa bằng một nhóm mà nó không phục vụ được.</w:t>
       </w:r>
     </w:p>
     <w:p>

</xml_diff>